<commit_message>
Update resume to final version
Update resume to final version
</commit_message>
<xml_diff>
--- a/Matti_Balcha_Website_Resume.docx
+++ b/Matti_Balcha_Website_Resume.docx
@@ -48,25 +48,7 @@
           <w:sz w:val="18"/>
           <w:szCs w:val="18"/>
         </w:rPr>
-        <w:t xml:space="preserve">📍 Stafford, VA  </w:t>
-      </w:r>
-      <w:r>
-        <w:rPr>
-          <w:rFonts w:ascii="Calibri" w:cs="Calibri" w:eastAsia="Calibri" w:hAnsi="Calibri"/>
-          <w:color w:val="595959"/>
-          <w:sz w:val="18"/>
-          <w:szCs w:val="18"/>
-        </w:rPr>
-        <w:t xml:space="preserve">  ✆ (571) 276-5384  </w:t>
-      </w:r>
-      <w:r>
-        <w:rPr>
-          <w:rFonts w:ascii="Calibri" w:cs="Calibri" w:eastAsia="Calibri" w:hAnsi="Calibri"/>
-          <w:color w:val="595959"/>
-          <w:sz w:val="18"/>
-          <w:szCs w:val="18"/>
-        </w:rPr>
-        <w:t xml:space="preserve">  ✉ mattibalchaa@gmail.com  </w:t>
+        <w:t xml:space="preserve">📍 Stafford, VA    ✆ (571) 276-5384    ✉ mattibalchaa@gmail.com  </w:t>
       </w:r>
     </w:p>
     <w:p>
@@ -81,25 +63,7 @@
           <w:sz w:val="18"/>
           <w:szCs w:val="18"/>
         </w:rPr>
-        <w:t xml:space="preserve">🔗 linkedin.com/in/mattibalcha  </w:t>
-      </w:r>
-      <w:r>
-        <w:rPr>
-          <w:rFonts w:ascii="Calibri" w:cs="Calibri" w:eastAsia="Calibri" w:hAnsi="Calibri"/>
-          <w:color w:val="2E75B6"/>
-          <w:sz w:val="18"/>
-          <w:szCs w:val="18"/>
-        </w:rPr>
-        <w:t xml:space="preserve">  🌐 [YOUR-WEBSITE-URL]  </w:t>
-      </w:r>
-      <w:r>
-        <w:rPr>
-          <w:rFonts w:ascii="Calibri" w:cs="Calibri" w:eastAsia="Calibri" w:hAnsi="Calibri"/>
-          <w:color w:val="2E75B6"/>
-          <w:sz w:val="18"/>
-          <w:szCs w:val="18"/>
-        </w:rPr>
-        <w:t xml:space="preserve">  💻 [github.com/YOUR-USERNAME]</w:t>
+        <w:t>🔗 linkedin.com/in/mattibalcha    🌐 mattibalcha.github.io    💻 github.com/MattiBalcha</w:t>
       </w:r>
     </w:p>
     <w:p>
@@ -2207,7 +2171,7 @@
           <w:sz w:val="18"/>
           <w:szCs w:val="18"/>
         </w:rPr>
-        <w:t xml:space="preserve">[YOUR-WEBSITE-URL]</w:t>
+        <w:t xml:space="preserve">mattibalcha.github.io</w:t>
       </w:r>
       <w:r>
         <w:rPr>
@@ -2225,7 +2189,7 @@
           <w:sz w:val="18"/>
           <w:szCs w:val="18"/>
         </w:rPr>
-        <w:t xml:space="preserve">[github.com/YOUR-USERNAME]</w:t>
+        <w:t xml:space="preserve">github.com/MattiBalcha</w:t>
       </w:r>
       <w:r>
         <w:rPr>
@@ -2243,7 +2207,7 @@
           <w:sz w:val="18"/>
           <w:szCs w:val="18"/>
         </w:rPr>
-        <w:t xml:space="preserve">[YOUR-PORTFOLIO-URL]</w:t>
+        <w:t xml:space="preserve">mattibalcha.github.io</w:t>
       </w:r>
     </w:p>
     <w:sectPr>

</xml_diff>